<commit_message>
Adiciona integrantes do grupo no README e no relatorio
</commit_message>
<xml_diff>
--- a/relatorio/Relatorio_Atividade3_Seguranca_Sistemas.docx
+++ b/relatorio/Relatorio_Atividade3_Seguranca_Sistemas.docx
@@ -76,7 +76,7 @@
     </w:p>
     <w:p>
       <w:pPr>
-        <w:spacing w:before="1600"/>
+        <w:spacing w:before="1000"/>
       </w:pPr>
     </w:p>
     <w:p>
@@ -86,15 +86,88 @@
       <w:r>
         <w:rPr>
           <w:rFonts w:ascii="Calibri" w:cs="Calibri" w:eastAsia="Calibri" w:hAnsi="Calibri"/>
+          <w:b/>
+          <w:bCs/>
+          <w:color w:val="2E74B5"/>
           <w:sz w:val="22"/>
           <w:szCs w:val="22"/>
         </w:rPr>
-        <w:t xml:space="preserve">Aluno: Kauã Enrico</w:t>
-      </w:r>
-    </w:p>
-    <w:p>
-      <w:pPr>
-        <w:spacing w:before="60"/>
+        <w:t xml:space="preserve">Integrantes do grupo</w:t>
+      </w:r>
+    </w:p>
+    <w:p>
+      <w:pPr>
+        <w:spacing w:before="120"/>
+        <w:jc w:val="center"/>
+      </w:pPr>
+      <w:r>
+        <w:rPr>
+          <w:rFonts w:ascii="Calibri" w:cs="Calibri" w:eastAsia="Calibri" w:hAnsi="Calibri"/>
+          <w:sz w:val="22"/>
+          <w:szCs w:val="22"/>
+        </w:rPr>
+        <w:t xml:space="preserve">Lucas Gabriel Bento Correa — RA: 220020281</w:t>
+      </w:r>
+    </w:p>
+    <w:p>
+      <w:pPr>
+        <w:spacing w:before="40"/>
+        <w:jc w:val="center"/>
+      </w:pPr>
+      <w:r>
+        <w:rPr>
+          <w:rFonts w:ascii="Calibri" w:cs="Calibri" w:eastAsia="Calibri" w:hAnsi="Calibri"/>
+          <w:sz w:val="22"/>
+          <w:szCs w:val="22"/>
+        </w:rPr>
+        <w:t xml:space="preserve">Leonardo Fernandes Fanhani — RA: 220020517</w:t>
+      </w:r>
+    </w:p>
+    <w:p>
+      <w:pPr>
+        <w:spacing w:before="40"/>
+        <w:jc w:val="center"/>
+      </w:pPr>
+      <w:r>
+        <w:rPr>
+          <w:rFonts w:ascii="Calibri" w:cs="Calibri" w:eastAsia="Calibri" w:hAnsi="Calibri"/>
+          <w:sz w:val="22"/>
+          <w:szCs w:val="22"/>
+        </w:rPr>
+        <w:t xml:space="preserve">Kauã Enrico Pasti Altran — RA: 220019627</w:t>
+      </w:r>
+    </w:p>
+    <w:p>
+      <w:pPr>
+        <w:spacing w:before="40"/>
+        <w:jc w:val="center"/>
+      </w:pPr>
+      <w:r>
+        <w:rPr>
+          <w:rFonts w:ascii="Calibri" w:cs="Calibri" w:eastAsia="Calibri" w:hAnsi="Calibri"/>
+          <w:sz w:val="22"/>
+          <w:szCs w:val="22"/>
+        </w:rPr>
+        <w:t xml:space="preserve">Henrique Pignato — RA: 220020592</w:t>
+      </w:r>
+    </w:p>
+    <w:p>
+      <w:pPr>
+        <w:spacing w:before="40"/>
+        <w:jc w:val="center"/>
+      </w:pPr>
+      <w:r>
+        <w:rPr>
+          <w:rFonts w:ascii="Calibri" w:cs="Calibri" w:eastAsia="Calibri" w:hAnsi="Calibri"/>
+          <w:sz w:val="22"/>
+          <w:szCs w:val="22"/>
+        </w:rPr>
+        <w:t xml:space="preserve">Luke Gabriel dos Santos Belatine — RA: 220020097</w:t>
+      </w:r>
+    </w:p>
+    <w:p>
+      <w:pPr>
+        <w:spacing w:before="360"/>
         <w:jc w:val="center"/>
       </w:pPr>
       <w:r>
@@ -2487,7 +2560,7 @@
       <w:pPr>
         <w:spacing w:after="200"/>
       </w:pPr>
-      <w:hyperlink w:history="1" r:id="rIdfo316yjfm8tiu5sagetqr">
+      <w:hyperlink w:history="1" r:id="rIdlntjkk5e6x-wdy6vlshcn">
         <w:r>
           <w:rPr>
             <w:rStyle w:val="Hyperlink"/>

</xml_diff>